<commit_message>
Revisions after independent reviews: pre-specified wording, post-hoc diagnostics, ledger, consistency and final audit, raw data snapshot
Co-Authored-By: Claude Sonnet 5.5 <noreply@anthropic.com>
Claude-Session: https://claude.ai/code/session_01QHzkZ7jvqQ7qpsTaxao7k1
</commit_message>
<xml_diff>
--- a/manuscript/Final_Manuscript.docx
+++ b/manuscript/Final_Manuscript.docx
@@ -13,7 +13,7 @@
           <w:i w:val="0"/>
           <w:sz w:val="30"/>
         </w:rPr>
-        <w:t>How well do a journal's past turnaround times predict the next paper's? A pre-registered out-of-time evaluation across 800 journals</w:t>
+        <w:t>How well do a journal's past turnaround times predict the next paper's? A pre-specified out-of-time evaluation across 800 journals</w:t>
       </w:r>
     </w:p>
     <w:p>
@@ -40,7 +40,7 @@
           <w:i/>
           <w:sz w:val="18"/>
         </w:rPr>
-        <w:t>Manuscript prepared for submission to Accountability in Research (best-available target; see cover letter). Word count: 3,291 words (title page to conclusion, excluding tables, captions in tables, declarations and references).</w:t>
+        <w:t>Manuscript prepared for submission to Accountability in Research (best-available target; see cover letter). Word count: 4,317 words (title page to conclusion, excluding tables, captions in tables, declarations and references).</w:t>
       </w:r>
     </w:p>
     <w:p>
@@ -60,7 +60,7 @@
           <w:b w:val="0"/>
           <w:i w:val="0"/>
         </w:rPr>
-        <w:t>Authors, funders and evaluators routinely use a journal's stated or past turnaround as a forecast of how long a newly submitted paper will take, but such statistics have not been tested out of time. We pre-registered an evaluation using publisher-deposited submission and acceptance dates for 1,737,272 research articles from 800 Springer Nature, Wiley and Taylor &amp; Francis journals. At two forecast origins (1 January 2023 and 2024), forecasts built only from papers already visible were scored against all 298,469 papers submitted to 781 journals in the following six months, using pinball loss, interval coverage and event-probability scores. Journal identity explained 26.5% (95% CI 24.7%–28.3%) of the variance of log acceptance time; 69.1% lay between articles within a journal-year. Journal-specific empirical forecasts lowered pinball loss by 15.7% relative to publisher-pooled forecasts, yet nominal 80% intervals covered only 77.0% of later papers and the average interval spanned a five-fold range of days. Parametric and shrinkage forecasters did not improve on simple empirical quantiles. Only 12.0% of journal-origins had at least half of their papers accepted within 72 days and 1.6% at least 80%; when past data indicated at least 80%, 75% was realised. Author count and reference count improved forecasts by about 3%. Results replicated in 58 journal-origins from PubMed-indexed journals of other publishers. Journal-level turnaround statistics are informative but should be reported and used as wide, drifting distributions rather than point guarantees. Conclusions are conditional on acceptance and on publisher-defined submission dates.</w:t>
+        <w:t>Authors, funders and evaluators routinely use a journal's stated or past turnaround as a forecast of how long a newly submitted paper will take, but such statistics have not been tested out of time. We pre-specified an evaluation using publisher-deposited submission and acceptance dates for 1,737,272 research articles from 800 Springer Nature, Wiley and Taylor &amp; Francis journals. At two forecast origins (1 January 2023 and 2024), forecasts built only from papers already visible were scored against all 298,469 papers submitted to 781 journals in the following six months, using pinball loss, interval coverage and event-probability scores. Journal identity explained 26.5% (95% CI 24.7%–28.3%) of the variance of log acceptance time; 69.1% lay between articles within a journal-year. Journal-specific empirical forecasts lowered pinball loss by 15.7% relative to publisher-pooled forecasts, yet nominal 80% intervals covered only 77.0% of later papers and the average interval spanned a five-fold range of days. Parametric and shrinkage forecasters did not improve on simple empirical quantiles; a post-hoc diagnostic indicated that roughly half of the under-coverage arises because slow papers are not yet visible. Only 12.0% of journal-origins had at least half of their papers accepted within 72 days and 1.6% at least 80%; when past data indicated at least 80%, 75% was realised. Author and reference counts improved forecasts by about 3% (1.4% with strictly pre-submission features). A check on 58 journal-origins from a non-random set of PubMed-indexed journals outside the frame gave a similar picture, with a smaller coverage shortfall (-0.8 points). Journal-level turnaround statistics are informative but should be reported and used as wide, drifting distributions rather than point guarantees. Conclusions are conditional on acceptance and on publisher-defined submission dates.</w:t>
       </w:r>
     </w:p>
     <w:p>
@@ -116,7 +116,7 @@
           <w:b w:val="0"/>
           <w:i w:val="0"/>
         </w:rPr>
-        <w:t>We therefore ask five questions. RQ1: how much of the variance of acceptance time lies between journals, between years within journals, and between articles? RQ2: how accurate and calibrated are out-of-time forecasts of a journal's acceptance-time distribution built from its visible past, and which simple estimator is best? RQ3: how large is drift relative to sampling noise? RQ4: how often does past evidence support a claim that a given share of papers is accepted within 72 days, and how reliable are such claims out of time? RQ5: do article features observable around submission improve on the journal-level forecast? The study is empirical meta-research. It makes no causal claims and does not propose new theory.</w:t>
+        <w:t>We therefore ask five questions. RQ1: how much of the variance of acceptance time lies between journals, between years within journals, and between articles? RQ2: how accurate and calibrated are out-of-time forecasts of a journal's acceptance-time distribution built from its visible past, and which simple estimator is best? RQ3: how large is drift relative to sampling noise? RQ4: how often does past evidence support a claim that a given share of papers is accepted within 72 days, and how reliable are such claims out of time? RQ5: do article features observable around submission improve on the journal-level forecast? RQ1 extends the variance partition of Björk and Solomon (2013) to a larger and more recent dataset; RQ2–RQ5 are, as far as our searches (which did not include reading every full text) could establish, not addressed in earlier work. The study is empirical meta-research. It makes no causal claims and does not propose new theory.</w:t>
       </w:r>
     </w:p>
     <w:p>
@@ -132,7 +132,7 @@
         <w:pStyle w:val="Heading2"/>
       </w:pPr>
       <w:r>
-        <w:t>2.1 Pre-registration and transparency</w:t>
+        <w:t>2.1 Pre-specification and transparency</w:t>
       </w:r>
     </w:p>
     <w:p>
@@ -144,7 +144,7 @@
           <w:b w:val="0"/>
           <w:i w:val="0"/>
         </w:rPr>
-        <w:t>The protocol (frame, cleaning rules, cohorts, forecasters, metrics, seven confirmatory contrasts and five confirmatory hypotheses) was frozen in the project repository before any forecast error was computed (protocol v1.0, 20 October 2026). Five post-freeze amendments (all before the confirmatory run, or clarifications that did not alter results) are logged in the repository. Hypothesis thresholds were set in advance; unsupported hypotheses are reported as such. A first research direction (duplicate contamination in tabular machine-learning benchmarks) was abandoned before any model was run after a prior-art search found overlapping work; the audit trail is in the repository.</w:t>
+        <w:t>The protocol (frame, cleaning rules, cohorts, forecasters, metrics, seven confirmatory contrasts and five confirmatory hypotheses) was committed to the project's git history before any forecast error was computed (protocol v1.0, 20 October 2026). This is a pre-specification by the analyst, not a registered report: there is no external registry entry or independent time stamp. Eleven amendments, documentation corrections and post-hoc additions (D1–D11) are logged in the repository, including several that came after results were seen (D5–D7, D10; exploratory). Hypothesis thresholds were set in advance; unsupported hypotheses are reported as such. A first research direction (duplicate contamination in tabular machine-learning benchmarks) was abandoned before any model was run after a prior-art search found overlapping work; the audit trail is in the repository.</w:t>
       </w:r>
     </w:p>
     <w:p>
@@ -164,7 +164,7 @@
           <w:b w:val="0"/>
           <w:i w:val="0"/>
         </w:rPr>
-        <w:t>Article-level submission (‘received’) and acceptance dates are deposited in Crossref metadata by Springer Nature, Wiley and Taylor &amp; Francis. For each of these three members we took the 1,000 ISSNs with most journal articles published in 2023, merged print and online ISSNs (1,684 journals), and kept journals in which at least 80% of 40 random 2023 records carried both dates and the estimated number of dated 2023 articles was between 150 and 3,000. All 802 resulting journals were downloaded (census of the frame; publication dates 1 January 2021 to 20 October 2026; data cutoff 20 October 2026). The frame excludes small and very large journals and all publishers that do not deposit dates (notably Elsevier and IEEE). The estimand is D, the number of days from received to accepted, conditional on acceptance; rejected papers are not observable.</w:t>
+        <w:t>Article-level submission (‘received’) and acceptance dates are deposited in Crossref metadata by Springer Nature, Wiley and Taylor &amp; Francis. For each of these three members we took the 1,000 ISSNs with most journal articles published in 2023, merged print and online ISSNs (1,684 journals), and kept journals in which at least 80% of 40 random 2023 records carried both dates and the estimated number of dated 2023 articles was between 150 and 3,000. All 802 resulting entries were downloaded (census of the frame; two ISSN pairs were not merged and appear as duplicates, so the cleaned data contain 800 distinct journals; publication dates 1 January 2021 to 20 October 2026; data cutoff 20 October 2026). The frame excludes small and very large journals and all publishers that do not deposit dates (notably Elsevier and IEEE). The estimand is D, the number of days from received to accepted, conditional on acceptance; rejected papers are not observable.</w:t>
       </w:r>
     </w:p>
     <w:p>
@@ -280,7 +280,7 @@
           <w:b w:val="0"/>
           <w:i w:val="0"/>
         </w:rPr>
-        <w:t>The primary score is the mean pinball loss over the 19 quantile levels on the ln-day scale (Koenker &amp; Bassett, 1978), a proper score for quantile forecasts approximating the continuous ranked probability score (Gneiting &amp; Raftery, 2007). Secondary scores are coverage of central 80% and 50% intervals, the Winkler interval score (Winkler, 1972), Brier scores for the events D ≤ 72, 120 and 180 days, and probability-integral-transform histograms (Gneiting et al., 2007). Journals are the unit of analysis: scores are averaged over origins within journal. Uncertainty comes from a journal-cluster bootstrap (5,000 resamples, seed 20261020; Efron, 1979; Field &amp; Welsh, 2007); paired comparisons use Wilcoxon signed-rank tests (Wilcoxon, 1945) with Holm correction over seven pre-specified contrasts, reported with rank-biserial effect sizes. Realised shares of papers accepted within T days carry Clopper–Pearson intervals (Clopper &amp; Pearson, 1934).</w:t>
+        <w:t>The primary score is the mean pinball loss over the 19 quantile levels on the ln-day scale (Koenker &amp; Bassett, 1978), a proper score for quantile forecasts approximating the continuous ranked probability score (Gneiting &amp; Raftery, 2007). Secondary scores are coverage of central 80% and 50% intervals, the Winkler interval score (Winkler, 1972), Brier scores for the events D ≤ 72, 120 and 180 days, and probability-integral-transform histograms (Gneiting et al., 2007). Journals are the unit of analysis: scores are averaged over origins within journal. Uncertainty comes from journal-cluster bootstraps (5,000 resamples for forecast comparisons, 1,000 for variance components, 2,000 for the article-level and post-hoc analyses; seed 20261020; Efron, 1979; Field &amp; Welsh, 2007); paired comparisons use Wilcoxon signed-rank tests (Wilcoxon, 1945) with Holm correction over seven pre-specified contrasts, reported with rank-biserial effect sizes. Realised shares of papers accepted within T days carry Clopper–Pearson intervals (Clopper &amp; Pearson, 1934).</w:t>
       </w:r>
     </w:p>
     <w:p>
@@ -293,6 +293,18 @@
           <w:i w:val="0"/>
         </w:rPr>
         <w:t>Variance components of ln D (journal, journal × acceptance year, residual) were estimated by method of moments from acceptance years 2021–2025 with at most 300 records per journal-year; the estimator was checked on simulated data with known components (unit tests) and intervals come from bootstrapping journals. Drift was measured as the change in a journal's median ln D between consecutive acceptance years relative to a permutation null. For RQ5, LightGBM quantile regressions (Ke et al., 2017) were trained to predict ln D from the journal's F4 quantile plus the number of authors, received month, received weekday and log references, with five-fold cross-validation grouped by journal; the comparator was the same learner without article covariates and the F4 quantile alone. Reference count is a property of the final version and is therefore only a proxy for information known at submission. Software: Python 3.13, NumPy, pandas, SciPy and LightGBM (Harris et al., 2020; Virtanen et al., 2020).</w:t>
+      </w:r>
+    </w:p>
+    <w:p>
+      <w:pPr>
+        <w:spacing w:after="120"/>
+      </w:pPr>
+      <w:r>
+        <w:rPr>
+          <w:b w:val="0"/>
+          <w:i w:val="0"/>
+        </w:rPr>
+        <w:t>Post-hoc analyses (exploratory, logged as deviations D6–D7). After internal review we (i) added a journal-cluster bootstrap for the share of journals reaching a given realised share of papers within 72 days, because the two origins of a journal are dependent; (ii) coded journals coarsely into fields by title keywords (chemistry/materials/physics, clinical medicine, engineering/computing, other; not validated); and (iii) ran a diagnostic that retrains F0 on three information sets—the visible set, the submission cohort of the preceding 12 months truncated at the origin (only papers already accepted), and an oracle submission cohort that includes papers accepted after the origin—to separate information truncation from change over time.</w:t>
       </w:r>
     </w:p>
     <w:p>
@@ -649,7 +661,7 @@
           <w:b w:val="0"/>
           <w:i w:val="0"/>
         </w:rPr>
-        <w:t>The evaluation covered 1,531 journal-origins from 781 journals and 298,469 target papers. Journal-specific forecasts clearly beat the publisher-pooled forecast (F0 minus F2 pinball difference -0.0376, 95% CI -0.0414 to -0.0339; skill 15.7%; Table 2, Figure 3). Differences between the journal-specific forecasters were small. The simple empirical forecaster (F0) outperformed the lognormal (F3) and the empirical-Bayes lognormal (F4); F4 was worse than F0 in every size stratum (29, 579 and 173 journals; Holm-adjusted p 0.053, &lt;0.001, 0.003), so H3 was not supported. Time-decayed weighting (F6) was marginally better than F0 and a 24-month window (F1) marginally worse; all these differences were below 2% of loss (Table 3).</w:t>
+        <w:t>The evaluation covered 1,531 journal-origins from 781 journals and 298,469 target papers. Journal-specific forecasts clearly beat the publisher-pooled forecast (F0 minus F2 pinball difference -0.0376, 95% CI -0.0414 to -0.0339; skill 15.7%; Table 2, Figure 3). Differences between the journal-specific forecasters were small. The simple empirical forecaster (F0) outperformed the lognormal (F3) and the empirical-Bayes lognormal (F4); F4 was worse than F0 in all three size strata (significantly in the two larger ones, 579 and 173 journals, Holm-adjusted p &lt; 0.001 and 0.003; borderline in the 29 journals with fewer than 150 visible papers, p = 0.053), so H3 was not supported. Because the eligibility rule (at least 100 visible papers) removes the small-sample regime where shrinkage should matter, and because a lognormal is a poor description of these data, this is not a general test of shrinkage: an exploratory shrinkage of the empirical quantiles themselves (F7) and a six-month persistence forecaster (F8) also failed to improve on F0 in any stratum (overall difference F7 − F0 +0.0001, F8 − F0 +0.0004); only 6 journals had 30–99 visible papers, too few for a conclusion in that regime. Time-decayed weighting (F6) was marginally better than F0 and a 24-month window (F1) marginally worse; all these differences were below 2% of loss (Table 3).</w:t>
       </w:r>
     </w:p>
     <w:p>
@@ -1843,7 +1855,7 @@
         <w:pStyle w:val="Heading2"/>
       </w:pPr>
       <w:r>
-        <w:t>3.3 Drift (RQ3, exploratory)</w:t>
+        <w:t>3.3 Why do intervals under-cover? A post-hoc diagnostic</w:t>
       </w:r>
     </w:p>
     <w:p>
@@ -1855,7 +1867,27 @@
           <w:b w:val="0"/>
           <w:i w:val="0"/>
         </w:rPr>
-        <w:t>The mean squared year-to-year change in a journal's median ln D was 7.3 times the value expected from sampling noise alone (permutation null; 3,105 journal-year pairs). The median absolute change was 0.09 ln-units (about 9%); 18.8% of pairs changed by more than 0.2 ln-units (about 22%) and 1.9% by more than 0.5. Drift is therefore a first-order source of forecast error, consistent with the coverage shortfall above (Figure 5).</w:t>
+        <w:t>Training F0 on the visible set gave coverage -3.0 points (as in Table 2). The oracle complete submission cohort, which uses papers accepted after the origin and is therefore not available to an author, still under-covered, by -1.5 points (95% CI -1.9 to -1.2) and lowered pinball loss by 1.8%. Roughly half of the shortfall therefore arises because slow papers have not yet been accepted when the forecast is made, and half remains when that information is supplied, which is consistent with change between the training and target cohorts (drift) but could also reflect compositional changes we cannot observe. Finite-sample variability under independent sampling at the observed training sizes would account for only -0.3 points (simulation), and journal ln D rose by 0.074 ln-units (7.7%) between acceptance years 2021 and 2025, so a mild secular slowing is one candidate for the remainder. The shortfall was stable across four origins (2022–2025; F0 coverage -4.1, -3.3, -2.7 and -2.3 points; pooled -3.1, CI -3.4 to -2.7; the 2022 and 2025 origins are exploratory, with truncated windows and shorter follow-up respectively). A tempting shortcut—using only recently submitted papers that have already been accepted—was far worse: coverage -12.9 points (CI -13.7 to -12.2) and training medians 17% below the realised target medians.</w:t>
+      </w:r>
+    </w:p>
+    <w:p>
+      <w:pPr>
+        <w:pStyle w:val="Heading2"/>
+      </w:pPr>
+      <w:r>
+        <w:t>3.4 Drift (RQ3, exploratory)</w:t>
+      </w:r>
+    </w:p>
+    <w:p>
+      <w:pPr>
+        <w:spacing w:after="120"/>
+      </w:pPr>
+      <w:r>
+        <w:rPr>
+          <w:b w:val="0"/>
+          <w:i w:val="0"/>
+        </w:rPr>
+        <w:t>The mean squared year-to-year change in a journal's median ln D was 7.3 times the value expected from sampling noise alone (permutation null; 3,105 journal-year pairs). The median absolute change was 0.09 ln-units (about 9%); 18.8% of pairs changed by more than 0.2 ln-units (about 22%) and 1.9% by more than 0.5. Change over time is therefore a first-order feature of these data, consistent with the coverage shortfall that remains in the oracle diagnostic (Figure 5).</w:t>
       </w:r>
     </w:p>
     <w:tbl>
@@ -1976,7 +2008,7 @@
         <w:pStyle w:val="Heading2"/>
       </w:pPr>
       <w:r>
-        <w:t>3.4 How often is a 72-day claim supported? (RQ4)</w:t>
+        <w:t>3.5 How often is a 72-day claim supported? (RQ4)</w:t>
       </w:r>
     </w:p>
     <w:p>
@@ -1988,7 +2020,7 @@
           <w:b w:val="0"/>
           <w:i w:val="0"/>
         </w:rPr>
-        <w:t>In the target cohorts, the realised share of papers accepted within 72 days was at least 0.5 in 184 of 1,531 journal-origins (12.0%; 95% CI 10.4%–13.8%), at least 0.8 in 25 (1.6%) and at least 0.9 in 7 (0.5%; Table 3). H4 (fewer than 5% of journal-origins reaching 0.5) was therefore not supported: a minority of journals, concentrated in chemistry, materials, clinical medicine and engineering, did accept most papers within 72 days. Even so, past evidence overstated future speed at the fast end: for the 23 journal-origins whose F0 forecast of P(D ≤ 72) was at least 0.8 (mean forecast 86%), the realised share was 75%. Brier skill relative to the pooled forecast was 17.2% for the 72-day event.</w:t>
+        <w:t>In the target cohorts, the realised share of papers accepted within 72 days was at least 0.5 in 184 of 1,531 journal-origins (12.0%; 95% CI 10.4%–13.8%), at least 0.8 in 25 (1.6%) and at least 0.9 in 7 (0.5%; Table 3). The threshold of 72 days (about ten weeks) is illustrative of the maximum-time criteria used in some policies; 120 and 180 days are reported alongside. H4 (fewer than 5% of journal-origins reaching 0.5) was therefore not supported. Because the two origins of a journal are dependent, we also computed a journal-cluster bootstrap interval for the share reaching 0.5 (9.9%–14.2%) and for the share reaching 0.8 (0.9%–2.4%); 15.2% of journals reached 0.5 at one or both origins. A minority of journals did accept most papers within 72 days; by coarse title-keyword coding (exploratory, not validated) they were commonest among chemistry, materials and physics journals (28% of 99) and clinical-medicine journals (23% of 195), and rarer among engineering and computing journals (7% of 68) and other or unclassified journals (10% of 419). Excluding the six journals whose forecast or realised median was below 30 days, which may reflect re-submission dates, left the shares essentially unchanged (11.3% reaching 0.5). Even so, past evidence overstated future speed at the fast end: for the 23 journal-origins (19 journals; no interval, and subject to selection of extreme forecasts) whose F0 forecast of P(D ≤ 72) was at least 0.8 (mean forecast 86%), the realised share was 75%. Brier skill relative to the pooled forecast was 17.2% for the 72-day event.</w:t>
       </w:r>
     </w:p>
     <w:p>
@@ -2848,7 +2880,7 @@
           <w:b w:val="0"/>
           <w:i w:val="0"/>
         </w:rPr>
-        <w:t>In an exploratory descriptive cut of the most recent acceptance cohort (accepted 2025-04-20..2026-10-20), 61 of 773 journals with at least 100 recent papers had a median of 72 days or less and 6 had at least 80% of papers within 72 days. These journals were not in computing, information science or meta-research.</w:t>
+        <w:t>In an exploratory descriptive cut of the most recent acceptance cohort (accepted 2025-04-20..2026-10-20), 61 of 773 journals with at least 100 recent papers had a median of 72 days or less and 6 had at least 80% of papers within 72 days. None of them was a computing, information-science or meta-research journal.</w:t>
       </w:r>
     </w:p>
     <w:p>
@@ -2856,7 +2888,7 @@
         <w:pStyle w:val="Heading2"/>
       </w:pPr>
       <w:r>
-        <w:t>3.5 Article-level information (RQ5)</w:t>
+        <w:t>3.6 Article-level information (RQ5)</w:t>
       </w:r>
     </w:p>
     <w:p>
@@ -2868,7 +2900,7 @@
           <w:b w:val="0"/>
           <w:i w:val="0"/>
         </w:rPr>
-        <w:t>Adding the number of authors, received month, received weekday and log references to the journal-level quantile reduced pooled pinball loss by 3.2% (95% CI 2.5%–3.9%) relative to the same learner without covariates, and by 3.4% (2.6%–4.1%) relative to the F4 quantile alone. H5 (gain below 2%) was therefore not supported, although the gain is small. An exploratory ablation attributed it to author count and reference count (gain over the control when used alone: 0.9% and 1.3%); received month and weekday contributed essentially nothing (0.01%, 0.01%).</w:t>
+        <w:t>Adding the number of authors, received month, received weekday and log references to the journal-level quantile reduced pooled pinball loss by 3.2% (95% CI 2.5%–3.9%) relative to the same learner without covariates, and by 3.4% (2.6%–4.1%) relative to the F4 quantile alone. H5 (gain below 2%) was therefore not supported, although the gain is small. Because reference count is not strictly known before submission, we refitted with author count, received month and weekday only: the gain was 1.4% over the control (95% CI 1.0%–1.9%) and 1.6% over the F4 quantile (1.1%–2.1%); against the 2% threshold this is below it for the control comparison and straddles it for the F4 comparison. Removing the non-research filter raised the full-covariate gain to 5.4%, suggesting that reference count also acts as a proxy for article type. An exploratory ablation (different quantile levels, single run) attributed the gain to author count and reference count (gain over the control when used alone: 0.9% and 1.3%); received month and weekday contributed essentially nothing (0.01%, 0.01%).</w:t>
       </w:r>
     </w:p>
     <w:p>
@@ -2876,7 +2908,7 @@
         <w:pStyle w:val="Heading2"/>
       </w:pPr>
       <w:r>
-        <w:t>3.6 External validation and sensitivity</w:t>
+        <w:t>3.7 External validation and sensitivity</w:t>
       </w:r>
     </w:p>
     <w:p>
@@ -2888,7 +2920,7 @@
           <w:b w:val="0"/>
           <w:i w:val="0"/>
         </w:rPr>
-        <w:t>Crossref and PubMed dates agreed exactly for 99.997% (received) and 99.998% (accepted) of 59,885 shared DOIs; because both channels originate from the publishers' feeds this is a consistency check rather than independent verification. In 58 journal-origins from 32 non-frame PubMed journals, journal-specific forecasters again beat the pooled forecast by a similar margin (pinball skill of F0 over F2 14.8%; F0 80%-interval coverage 79.2%; F0 and F6 were practically tied, 0.1523 versus 0.1525, and F3 and F4 were less accurate). Removing the non-research filter or relaxing eligibility to 60/30 changed no conclusion (journal share 26.5% and 26.5%; F0 coverage shortfall 3.0 and 3.0 points; share of journal-origins with at least half within 72 days 13.2% and 11.9%). A complete re-run of the pipeline reproduced every result table and JSON file byte for byte.</w:t>
+        <w:t>Crossref and PubMed dates agreed exactly for 99.997% (received) and 99.998% (accepted) of 59,885 shared DOIs; because both channels originate from the publishers' feeds this is a consistency check rather than independent verification. In 58 journal-origins from 32 PubMed journals outside the frame (a non-random set taken from the Step-0 screening list; some belong to frame publishers but fall outside the volume window), journal-specific forecasters again beat the pooled forecast by a similar margin (pinball skill of F0 over F2 14.8%; F0 80%-interval coverage 79.2%, i.e. a smaller shortfall than in the main data; F0 and F6 were practically tied, 0.1523 versus 0.1525, and F3 and F4 were less accurate). Removing the non-research filter or relaxing eligibility to 60/30 changed no conclusion (journal share 26.5% and 26.5%; F0 coverage shortfall 3.0 and 3.0 points; share of journal-origins with at least half within 72 days 13.2% and 11.9%). Independent re-execution of the pipeline in a scratch copy reproduced every result table, JSON and figure file byte for byte apart from run-time metadata.</w:t>
       </w:r>
     </w:p>
     <w:p>
@@ -3265,7 +3297,7 @@
               <w:rPr>
                 <w:sz w:val="17"/>
               </w:rPr>
-              <w:t>12.0% [10.4%, 13.8%]</w:t>
+              <w:t>12.0% [CP 10.4%–13.8%; cluster 9.9%–14.2%]</w:t>
             </w:r>
           </w:p>
         </w:tc>
@@ -3503,7 +3535,7 @@
           <w:b w:val="0"/>
           <w:i w:val="0"/>
         </w:rPr>
-        <w:t>Three findings stand out. First, a journal's own history is genuinely informative but only moderately so: using it cuts forecast loss by about 16% relative to ignoring journal identity within a publisher, yet 69% of the variance lies between articles, so the resulting 80% intervals span roughly a five-fold range. The variance partition agrees with Björk and Solomon (2013) on a much larger and more recent dataset. Second, forecasts are biased towards optimism about speed: coverage is below nominal, more later papers fall beyond the 90th percentile than expected, and the fastest-looking journals did not keep their pace. Drift appears to be the main reason; the conformal adjustment, which assumes exchangeability, repaired only part of the shortfall. Third, the simplest estimators were hard to beat. The lognormal and shrinkage forecasters, which improve small-sample stability in principle, were no better, probably because a normal distribution on ln D is a poor description of the data: in an exploratory check, within-journal ln D was left-skewed (median skewness -0.79; 61% of 787 journals below −0.5) with excess kurtosis 2.1, reflecting a minority of very quick acceptances. With at least 100 visible papers per journal, shrinkage had little to add.</w:t>
+        <w:t>Three findings stand out. First, a journal's own history is genuinely informative but only moderately so: using it cuts forecast loss by about 16% relative to ignoring journal identity within a publisher, yet 69% of the variance lies between articles, so the resulting 80% intervals span roughly a five-fold range. The variance partition agrees with Björk and Solomon (2013) on a much larger and more recent dataset. Second, forecasts are biased towards optimism about speed: coverage is below nominal, more later papers fall beyond the 90th percentile than expected, and the fastest-looking journals did not keep their pace (which may partly reflect regression to the mean after selecting extreme journals). The post-hoc diagnostic suggests that about half of the coverage shortfall comes from the visible set lacking slow papers that are accepted later, and that half persists even with oracle information, consistent with change over time; the conformal adjustment, which assumes exchangeability, repaired only part of the shortfall. Turnaround statistics computed only from recently submitted papers that have already been accepted are far more optimistic still. Third, the simplest estimators were hard to beat. The lognormal and shrinkage forecasters, which improve small-sample stability in principle, were no better, probably because a normal distribution on ln D is a poor description of the data: in an exploratory check, within-journal ln D was left-skewed (median skewness -0.79; 61% of 787 journals below −0.5) with excess kurtosis 2.1, possibly reflecting a minority of very quick acceptances (not tested). With at least 100 visible papers per journal, shrinkage had little to add.</w:t>
       </w:r>
     </w:p>
     <w:p>
@@ -3580,7 +3612,34 @@
         <w:spacing w:after="60"/>
       </w:pPr>
       <w:r>
-        <w:t>Hypotheses H2–H5 were not supported; H2 failed its pre-registered rule narrowly. The pre-specified ±3-point and 5% thresholds were judgement calls made before seeing data.</w:t>
+        <w:t>Hypotheses H2–H5 were not supported; H2 failed its pre-specified rule narrowly, and the pre-specified Clopper–Pearson interval for H4 ignores the dependence of a journal's two origins (see the cluster bootstrap above). The pre-specified ±3-point and 5% thresholds were judgement calls made before seeing data.</w:t>
+      </w:r>
+    </w:p>
+    <w:p>
+      <w:pPr>
+        <w:pStyle w:val="ListBullet"/>
+        <w:spacing w:after="60"/>
+      </w:pPr>
+      <w:r>
+        <w:t>The frame was defined from 2023 volumes and journal-origins require at least 50 target papers; both use information that post-dates the earlier origin or the outcome, a mild selection effect. Only two confirmatory origins were used (four in exploratory checks).</w:t>
+      </w:r>
+    </w:p>
+    <w:p>
+      <w:pPr>
+        <w:pStyle w:val="ListBullet"/>
+        <w:spacing w:after="60"/>
+      </w:pPr>
+      <w:r>
+        <w:t>Baselines are simple: we did not evaluate richer forecasters (e.g., quantile regression on journal-level trend and size features), and the empirical-Bayes forecaster relies on a normal-theory sampling variance that is inappropriate for heavy-tailed data (excess kurtosis about 2).</w:t>
+      </w:r>
+    </w:p>
+    <w:p>
+      <w:pPr>
+        <w:pStyle w:val="ListBullet"/>
+        <w:spacing w:after="60"/>
+      </w:pPr>
+      <w:r>
+        <w:t>Full texts of most prior studies could not be read (abstract-level reading only), and the literature search was not systematic; probability-integral-transform histograms pool dependent journal-origins and carry no interval; the post-hoc analyses (D6–D7) were prompted by the results and are exploratory.</w:t>
       </w:r>
     </w:p>
     <w:p>
@@ -3768,7 +3827,7 @@
           <w:i w:val="0"/>
           <w:sz w:val="19"/>
         </w:rPr>
-        <w:t>Bilalli, B.; Munir, R.; Abelló, A. (2020). A framework for assessing the peer review duration of journals: case study in computer science. Scientometrics, 126(1), 545-563. https://doi.org/10.1007/s11192-020-03742-9</w:t>
+        <w:t>Bilalli, B.; Munir, R.; Abelló, A. (2021). A framework for assessing the peer review duration of journals: case study in computer science. Scientometrics, 126(1), 545-563. https://doi.org/10.1007/s11192-020-03742-9</w:t>
       </w:r>
     </w:p>
     <w:p>

</xml_diff>

<commit_message>
Retarget to Research Integrity and Peer Review on author instruction (impact factor priority); structured abstract and BMC-style declarations
Co-Authored-By: Claude Sonnet 5.5 <noreply@anthropic.com>
Claude-Session: https://claude.ai/code/session_01QHzkZ7jvqQ7qpsTaxao7k1
</commit_message>
<xml_diff>
--- a/manuscript/Final_Manuscript.docx
+++ b/manuscript/Final_Manuscript.docx
@@ -40,7 +40,7 @@
           <w:i/>
           <w:sz w:val="18"/>
         </w:rPr>
-        <w:t>Manuscript prepared for submission to Accountability in Research (best-available target; see cover letter). Word count: 4,317 words (title page to conclusion, excluding tables, captions in tables, declarations and references).</w:t>
+        <w:t>Manuscript prepared for submission to Research Integrity and Peer Review (target chosen by the author for impact factor; timeline and format requirements unverified; see journal_selection/selected_journal.md). Word count: 4,333 words (title page to conclusion, excluding tables, captions in tables, declarations and references).</w:t>
       </w:r>
     </w:p>
     <w:p>
@@ -53,6 +53,42 @@
     </w:p>
     <w:p>
       <w:pPr>
+        <w:spacing w:after="80"/>
+      </w:pPr>
+      <w:r>
+        <w:rPr>
+          <w:b w:val="0"/>
+          <w:i w:val="0"/>
+        </w:rPr>
+        <w:t xml:space="preserve">Background: Authors, funders and evaluators routinely use a journal's stated or past turnaround as a forecast of how long a newly submitted paper will take, but such statistics have not been tested out of time. </w:t>
+      </w:r>
+    </w:p>
+    <w:p>
+      <w:pPr>
+        <w:spacing w:after="80"/>
+      </w:pPr>
+      <w:r>
+        <w:rPr>
+          <w:b w:val="0"/>
+          <w:i w:val="0"/>
+        </w:rPr>
+        <w:t xml:space="preserve">Methods: We pre-specified an evaluation using publisher-deposited submission and acceptance dates for 1,737,272 research articles from 800 Springer Nature, Wiley and Taylor &amp; Francis journals. At two forecast origins (1 January 2023 and 2024), forecasts built only from papers already visible were scored against all 298,469 papers submitted to 781 journals in the following six months, using pinball loss, interval coverage and event-probability scores. </w:t>
+      </w:r>
+    </w:p>
+    <w:p>
+      <w:pPr>
+        <w:spacing w:after="80"/>
+      </w:pPr>
+      <w:r>
+        <w:rPr>
+          <w:b w:val="0"/>
+          <w:i w:val="0"/>
+        </w:rPr>
+        <w:t xml:space="preserve">Results: Journal identity explained 26.5% (95% CI 24.7%–28.3%) of the variance of log acceptance time; 69.1% lay between articles within a journal-year. Journal-specific empirical forecasts lowered pinball loss by 15.7% relative to publisher-pooled forecasts, yet nominal 80% intervals covered only 77.0% of later papers and the average interval spanned a five-fold range of days. Parametric and shrinkage forecasters did not improve on simple empirical quantiles; a post-hoc diagnostic indicated that roughly half of the under-coverage arises because slow papers are not yet visible. Only 12.0% of journal-origins had at least half of their papers accepted within 72 days and 1.6% at least 80%; when past data indicated at least 80%, 75% was realised. Author and reference counts improved forecasts by about 3% (1.4% with strictly pre-submission features). A check on 58 journal-origins from a non-random set of PubMed-indexed journals outside the frame gave a similar picture, with a smaller coverage shortfall (-0.8 points). </w:t>
+      </w:r>
+    </w:p>
+    <w:p>
+      <w:pPr>
         <w:spacing w:after="160"/>
       </w:pPr>
       <w:r>
@@ -60,7 +96,7 @@
           <w:b w:val="0"/>
           <w:i w:val="0"/>
         </w:rPr>
-        <w:t>Authors, funders and evaluators routinely use a journal's stated or past turnaround as a forecast of how long a newly submitted paper will take, but such statistics have not been tested out of time. We pre-specified an evaluation using publisher-deposited submission and acceptance dates for 1,737,272 research articles from 800 Springer Nature, Wiley and Taylor &amp; Francis journals. At two forecast origins (1 January 2023 and 2024), forecasts built only from papers already visible were scored against all 298,469 papers submitted to 781 journals in the following six months, using pinball loss, interval coverage and event-probability scores. Journal identity explained 26.5% (95% CI 24.7%–28.3%) of the variance of log acceptance time; 69.1% lay between articles within a journal-year. Journal-specific empirical forecasts lowered pinball loss by 15.7% relative to publisher-pooled forecasts, yet nominal 80% intervals covered only 77.0% of later papers and the average interval spanned a five-fold range of days. Parametric and shrinkage forecasters did not improve on simple empirical quantiles; a post-hoc diagnostic indicated that roughly half of the under-coverage arises because slow papers are not yet visible. Only 12.0% of journal-origins had at least half of their papers accepted within 72 days and 1.6% at least 80%; when past data indicated at least 80%, 75% was realised. Author and reference counts improved forecasts by about 3% (1.4% with strictly pre-submission features). A check on 58 journal-origins from a non-random set of PubMed-indexed journals outside the frame gave a similar picture, with a smaller coverage shortfall (-0.8 points). Journal-level turnaround statistics are informative but should be reported and used as wide, drifting distributions rather than point guarantees. Conclusions are conditional on acceptance and on publisher-defined submission dates.</w:t>
+        <w:t>Conclusions: Journal-level turnaround statistics are informative but should be reported and used as wide, drifting distributions rather than point guarantees. Conclusions are conditional on acceptance and on publisher-defined submission dates.</w:t>
       </w:r>
     </w:p>
     <w:p>
@@ -3689,7 +3725,7 @@
           <w:i w:val="0"/>
           <w:sz w:val="20"/>
         </w:rPr>
-        <w:t>Author contributions: [to be completed by the authors]. The analysis code and a first draft of this manuscript were produced with the assistance of an AI system (Claude, Anthropic); the authors must review, take responsibility for and disclose this use in line with the journal's policy.</w:t>
+        <w:t>Authors' contributions: [to be completed by the authors]. The analysis code and a first draft of this manuscript were produced with the assistance of an AI system (Claude, Anthropic); the authors must review, take responsibility for and disclose this use in line with the journal's policy.</w:t>
       </w:r>
     </w:p>
     <w:p>
@@ -3715,7 +3751,7 @@
           <w:i w:val="0"/>
           <w:sz w:val="20"/>
         </w:rPr>
-        <w:t>Conflicts of interest: [to be completed by the authors].</w:t>
+        <w:t>Competing interests: [to be completed by the authors].</w:t>
       </w:r>
     </w:p>
     <w:p>
@@ -3728,7 +3764,7 @@
           <w:i w:val="0"/>
           <w:sz w:val="20"/>
         </w:rPr>
-        <w:t>Ethics: the study analyses publicly available article metadata and involves no human participants or personal data beyond bibliographic author counts; no ethics approval was sought [authors to confirm].</w:t>
+        <w:t>Consent for publication: not applicable.</w:t>
       </w:r>
     </w:p>
     <w:p>
@@ -3741,7 +3777,20 @@
           <w:i w:val="0"/>
           <w:sz w:val="20"/>
         </w:rPr>
-        <w:t>Data availability: raw records are retrievable from the public Crossref and PubMed APIs; collection and processing scripts, cleaned-data generation, configuration and all derived results are in the project repository (private at the time of writing). A public, DOI-bearing deposit (e.g. Zenodo) has NOT yet been made and must be created before submission.</w:t>
+        <w:t>Ethics approval and consent to participate: not applicable — the study analyses publicly available article metadata and involves no human participants or personal data beyond bibliographic author counts; no ethics approval was sought [authors to confirm].</w:t>
+      </w:r>
+    </w:p>
+    <w:p>
+      <w:pPr>
+        <w:spacing w:after="60"/>
+      </w:pPr>
+      <w:r>
+        <w:rPr>
+          <w:b w:val="0"/>
+          <w:i w:val="0"/>
+          <w:sz w:val="20"/>
+        </w:rPr>
+        <w:t>Availability of data and materials: raw records are retrievable from the public Crossref and PubMed APIs; collection and processing scripts, cleaned-data generation, configuration and all derived results are in the project repository (private at the time of writing). A public, DOI-bearing deposit (e.g. Zenodo) has NOT yet been made and must be created before submission.</w:t>
       </w:r>
     </w:p>
     <w:p>

</xml_diff>